<commit_message>
Cronograma: Adicionado botão de nova subetapa dentro de cada pasta com persistência
</commit_message>
<xml_diff>
--- a/Cronograma de obra.docx
+++ b/Cronograma de obra.docx
@@ -3,91 +3,43 @@
 <w:document xmlns:wpc="http://schemas.microsoft.com/office/word/2010/wordprocessingCanvas" xmlns:cx="http://schemas.microsoft.com/office/drawing/2014/chartex" xmlns:cx1="http://schemas.microsoft.com/office/drawing/2015/9/8/chartex" xmlns:cx2="http://schemas.microsoft.com/office/drawing/2015/10/21/chartex" xmlns:cx3="http://schemas.microsoft.com/office/drawing/2016/5/9/chartex" xmlns:cx4="http://schemas.microsoft.com/office/drawing/2016/5/10/chartex" xmlns:cx5="http://schemas.microsoft.com/office/drawing/2016/5/11/chartex" xmlns:cx6="http://schemas.microsoft.com/office/drawing/2016/5/12/chartex" xmlns:cx7="http://schemas.microsoft.com/office/drawing/2016/5/13/chartex" xmlns:cx8="http://schemas.microsoft.com/office/drawing/2016/5/14/chartex" xmlns:mc="http://schemas.openxmlformats.org/markup-compatibility/2006" xmlns:aink="http://schemas.microsoft.com/office/drawing/2016/ink" xmlns:am3d="http://schemas.microsoft.com/office/drawing/2017/model3d" xmlns:o="urn:schemas-microsoft-com:office:office" xmlns:oel="http://schemas.microsoft.com/office/2019/extlst" xmlns:r="http://schemas.openxmlformats.org/officeDocument/2006/relationships" xmlns:m="http://schemas.openxmlformats.org/officeDocument/2006/math" xmlns:v="urn:schemas-microsoft-com:vml" xmlns:wp14="http://schemas.microsoft.com/office/word/2010/wordprocessingDrawing" xmlns:wp="http://schemas.openxmlformats.org/drawingml/2006/wordprocessingDrawing" xmlns:w10="urn:schemas-microsoft-com:office:word" xmlns:w="http://schemas.openxmlformats.org/wordprocessingml/2006/main" xmlns:w14="http://schemas.microsoft.com/office/word/2010/wordml" xmlns:w15="http://schemas.microsoft.com/office/word/2012/wordml" xmlns:w16cex="http://schemas.microsoft.com/office/word/2018/wordml/cex" xmlns:w16cid="http://schemas.microsoft.com/office/word/2016/wordml/cid" xmlns:w16="http://schemas.microsoft.com/office/word/2018/wordml" xmlns:w16du="http://schemas.microsoft.com/office/word/2023/wordml/word16du" xmlns:w16sdtdh="http://schemas.microsoft.com/office/word/2020/wordml/sdtdatahash" xmlns:w16sdtfl="http://schemas.microsoft.com/office/word/2024/wordml/sdtformatlock" xmlns:w16se="http://schemas.microsoft.com/office/word/2015/wordml/symex" xmlns:wpg="http://schemas.microsoft.com/office/word/2010/wordprocessingGroup" xmlns:wpi="http://schemas.microsoft.com/office/word/2010/wordprocessingInk" xmlns:wne="http://schemas.microsoft.com/office/word/2006/wordml" xmlns:wps="http://schemas.microsoft.com/office/word/2010/wordprocessingShape" mc:Ignorable="w14 w15 w16se w16cid w16 w16cex w16sdtdh w16sdtfl w16du wp14">
   <w:body>
     <w:p>
-      <w:proofErr w:type="gramStart"/>
-      <w:r>
-        <w:t>  1</w:t>
-      </w:r>
-      <w:proofErr w:type="gramEnd"/>
-      <w:r>
-        <w:t xml:space="preserve">. Planejamento e Serviços Preliminares: 3% a 5% </w:t>
-      </w:r>
-    </w:p>
-    <w:p>
-      <w:proofErr w:type="gramStart"/>
-      <w:r>
-        <w:t>  2</w:t>
-      </w:r>
-      <w:proofErr w:type="gramEnd"/>
-      <w:r>
-        <w:t xml:space="preserve">. Infraestrutura (Fundação): 10% a 15% </w:t>
-      </w:r>
-    </w:p>
-    <w:p>
-      <w:proofErr w:type="gramStart"/>
-      <w:r>
-        <w:t>  3</w:t>
-      </w:r>
-      <w:proofErr w:type="gramEnd"/>
-      <w:r>
-        <w:t xml:space="preserve">. </w:t>
-      </w:r>
-      <w:proofErr w:type="spellStart"/>
-      <w:r>
-        <w:t>Supraestrutura</w:t>
-      </w:r>
-      <w:proofErr w:type="spellEnd"/>
-      <w:r>
-        <w:t xml:space="preserve"> (Estrutura): 15% a 20% </w:t>
-      </w:r>
-    </w:p>
-    <w:p>
-      <w:proofErr w:type="gramStart"/>
-      <w:r>
-        <w:t>  4</w:t>
-      </w:r>
-      <w:proofErr w:type="gramEnd"/>
-      <w:r>
-        <w:t xml:space="preserve">. Alvenaria e Vedação: 10% a 15% </w:t>
-      </w:r>
-    </w:p>
-    <w:p>
-      <w:proofErr w:type="gramStart"/>
-      <w:r>
-        <w:t>  5</w:t>
-      </w:r>
-      <w:proofErr w:type="gramEnd"/>
-      <w:r>
-        <w:t xml:space="preserve">. Cobertura (Telhado): 5% a 8% </w:t>
-      </w:r>
-    </w:p>
-    <w:p>
-      <w:proofErr w:type="gramStart"/>
-      <w:r>
-        <w:t>  6</w:t>
-      </w:r>
-      <w:proofErr w:type="gramEnd"/>
-      <w:r>
-        <w:t xml:space="preserve">. Instalações Técnicas (Hidráulica/Elétrica): 10% a 12% </w:t>
-      </w:r>
-    </w:p>
-    <w:p>
-      <w:proofErr w:type="gramStart"/>
-      <w:r>
-        <w:t>  7</w:t>
-      </w:r>
-      <w:proofErr w:type="gramEnd"/>
-      <w:r>
-        <w:t xml:space="preserve">. Revestimentos e Acabamentos Internos: 20% a 30% </w:t>
-      </w:r>
-    </w:p>
-    <w:p>
-      <w:proofErr w:type="gramStart"/>
-      <w:r>
-        <w:t>  8</w:t>
-      </w:r>
-      <w:proofErr w:type="gramEnd"/>
-      <w:r>
-        <w:t xml:space="preserve">. Área Externa e Finalização: 5% a 10% </w:t>
+      <w:r>
+        <w:t xml:space="preserve">  1. Planejamento e Serviços Preliminares: 3% a 5% </w:t>
+      </w:r>
+    </w:p>
+    <w:p>
+      <w:r>
+        <w:t xml:space="preserve">  2. Infraestrutura (Fundação): 10% a 15% </w:t>
+      </w:r>
+    </w:p>
+    <w:p>
+      <w:r>
+        <w:t xml:space="preserve">  3. Supraestrutura (Estrutura): 15% a 20% </w:t>
+      </w:r>
+    </w:p>
+    <w:p>
+      <w:r>
+        <w:t xml:space="preserve">  4. Alvenaria e Vedação: 10% a 15% </w:t>
+      </w:r>
+    </w:p>
+    <w:p>
+      <w:r>
+        <w:t xml:space="preserve">  5. Cobertura (Telhado): 5% a 8% </w:t>
+      </w:r>
+    </w:p>
+    <w:p>
+      <w:r>
+        <w:t xml:space="preserve">  6. Instalações Técnicas (Hidráulica/Elétrica): 10% a 12% </w:t>
+      </w:r>
+    </w:p>
+    <w:p>
+      <w:r>
+        <w:t xml:space="preserve">  7. Revestimentos e Acabamentos Internos: 20% a 30% </w:t>
+      </w:r>
+    </w:p>
+    <w:p>
+      <w:r>
+        <w:t xml:space="preserve">  8. Área Externa e Finalização: 5% a 10% </w:t>
       </w:r>
     </w:p>
     <w:p/>
@@ -311,23 +263,7 @@
           <w:b/>
           <w:bCs/>
         </w:rPr>
-        <w:t xml:space="preserve">3. </w:t>
-      </w:r>
-      <w:proofErr w:type="spellStart"/>
-      <w:r>
-        <w:rPr>
-          <w:b/>
-          <w:bCs/>
-        </w:rPr>
-        <w:t>Supraestrutura</w:t>
-      </w:r>
-      <w:proofErr w:type="spellEnd"/>
-      <w:r>
-        <w:rPr>
-          <w:b/>
-          <w:bCs/>
-        </w:rPr>
-        <w:t xml:space="preserve"> (Estrutura)</w:t>
+        <w:t>3. Supraestrutura (Estrutura)</w:t>
       </w:r>
     </w:p>
     <w:p>
@@ -448,23 +384,7 @@
           <w:b/>
           <w:bCs/>
         </w:rPr>
-        <w:t xml:space="preserve">Vergas e </w:t>
-      </w:r>
-      <w:proofErr w:type="spellStart"/>
-      <w:r>
-        <w:rPr>
-          <w:b/>
-          <w:bCs/>
-        </w:rPr>
-        <w:t>Contravergas</w:t>
-      </w:r>
-      <w:proofErr w:type="spellEnd"/>
-      <w:r>
-        <w:rPr>
-          <w:b/>
-          <w:bCs/>
-        </w:rPr>
-        <w:t>:</w:t>
+        <w:t>Vergas e Contravergas:</w:t>
       </w:r>
       <w:r>
         <w:t xml:space="preserve"> Reforços sobre e sob vãos de janelas e portas.</w:t>
@@ -537,21 +457,12 @@
           <w:numId w:val="5"/>
         </w:numPr>
       </w:pPr>
-      <w:proofErr w:type="spellStart"/>
-      <w:r>
-        <w:rPr>
-          <w:b/>
-          <w:bCs/>
-        </w:rPr>
-        <w:t>Telhamento</w:t>
-      </w:r>
-      <w:proofErr w:type="spellEnd"/>
-      <w:r>
-        <w:rPr>
-          <w:b/>
-          <w:bCs/>
-        </w:rPr>
-        <w:t>:</w:t>
+      <w:r>
+        <w:rPr>
+          <w:b/>
+          <w:bCs/>
+        </w:rPr>
+        <w:t>Telhamento:</w:t>
       </w:r>
       <w:r>
         <w:t xml:space="preserve"> Colocação de telhas e vedação técnica.</w:t>
@@ -746,15 +657,7 @@
         <w:t>Forros:</w:t>
       </w:r>
       <w:r>
-        <w:t xml:space="preserve"> Gesso liso ou gesso acartonado (</w:t>
-      </w:r>
-      <w:proofErr w:type="spellStart"/>
-      <w:r>
-        <w:t>drywall</w:t>
-      </w:r>
-      <w:proofErr w:type="spellEnd"/>
-      <w:r>
-        <w:t>).</w:t>
+        <w:t xml:space="preserve"> Gesso liso ou gesso acartonado (drywall).</w:t>
       </w:r>
     </w:p>
     <w:p>
@@ -854,6 +757,38 @@
       </w:r>
     </w:p>
     <w:p/>
+    <w:p/>
+    <w:p>
+      <w:r>
+        <w:t>- Não refatore o código</w:t>
+      </w:r>
+    </w:p>
+    <w:p>
+      <w:r>
+        <w:t>- Não altere nomes de variáveis</w:t>
+      </w:r>
+    </w:p>
+    <w:p>
+      <w:r>
+        <w:t>- Não reorganize o arquivo</w:t>
+      </w:r>
+    </w:p>
+    <w:p>
+      <w:r>
+        <w:lastRenderedPageBreak/>
+        <w:t>- Não altere lógica existente</w:t>
+      </w:r>
+    </w:p>
+    <w:p>
+      <w:r>
+        <w:t>- Modifique apenas o necessário</w:t>
+      </w:r>
+    </w:p>
+    <w:p>
+      <w:r>
+        <w:t>- envie o git</w:t>
+      </w:r>
+    </w:p>
     <w:sectPr>
       <w:pgSz w:w="11906" w:h="16838"/>
       <w:pgMar w:top="1417" w:right="1701" w:bottom="1417" w:left="1701" w:header="708" w:footer="708" w:gutter="0"/>

</xml_diff>

<commit_message>
Cronograma: Edição de Etapa Pai, adição de subetapas internas e persistência visual
</commit_message>
<xml_diff>
--- a/Cronograma de obra.docx
+++ b/Cronograma de obra.docx
@@ -3,43 +3,91 @@
 <w:document xmlns:wpc="http://schemas.microsoft.com/office/word/2010/wordprocessingCanvas" xmlns:cx="http://schemas.microsoft.com/office/drawing/2014/chartex" xmlns:cx1="http://schemas.microsoft.com/office/drawing/2015/9/8/chartex" xmlns:cx2="http://schemas.microsoft.com/office/drawing/2015/10/21/chartex" xmlns:cx3="http://schemas.microsoft.com/office/drawing/2016/5/9/chartex" xmlns:cx4="http://schemas.microsoft.com/office/drawing/2016/5/10/chartex" xmlns:cx5="http://schemas.microsoft.com/office/drawing/2016/5/11/chartex" xmlns:cx6="http://schemas.microsoft.com/office/drawing/2016/5/12/chartex" xmlns:cx7="http://schemas.microsoft.com/office/drawing/2016/5/13/chartex" xmlns:cx8="http://schemas.microsoft.com/office/drawing/2016/5/14/chartex" xmlns:mc="http://schemas.openxmlformats.org/markup-compatibility/2006" xmlns:aink="http://schemas.microsoft.com/office/drawing/2016/ink" xmlns:am3d="http://schemas.microsoft.com/office/drawing/2017/model3d" xmlns:o="urn:schemas-microsoft-com:office:office" xmlns:oel="http://schemas.microsoft.com/office/2019/extlst" xmlns:r="http://schemas.openxmlformats.org/officeDocument/2006/relationships" xmlns:m="http://schemas.openxmlformats.org/officeDocument/2006/math" xmlns:v="urn:schemas-microsoft-com:vml" xmlns:wp14="http://schemas.microsoft.com/office/word/2010/wordprocessingDrawing" xmlns:wp="http://schemas.openxmlformats.org/drawingml/2006/wordprocessingDrawing" xmlns:w10="urn:schemas-microsoft-com:office:word" xmlns:w="http://schemas.openxmlformats.org/wordprocessingml/2006/main" xmlns:w14="http://schemas.microsoft.com/office/word/2010/wordml" xmlns:w15="http://schemas.microsoft.com/office/word/2012/wordml" xmlns:w16cex="http://schemas.microsoft.com/office/word/2018/wordml/cex" xmlns:w16cid="http://schemas.microsoft.com/office/word/2016/wordml/cid" xmlns:w16="http://schemas.microsoft.com/office/word/2018/wordml" xmlns:w16du="http://schemas.microsoft.com/office/word/2023/wordml/word16du" xmlns:w16sdtdh="http://schemas.microsoft.com/office/word/2020/wordml/sdtdatahash" xmlns:w16sdtfl="http://schemas.microsoft.com/office/word/2024/wordml/sdtformatlock" xmlns:w16se="http://schemas.microsoft.com/office/word/2015/wordml/symex" xmlns:wpg="http://schemas.microsoft.com/office/word/2010/wordprocessingGroup" xmlns:wpi="http://schemas.microsoft.com/office/word/2010/wordprocessingInk" xmlns:wne="http://schemas.microsoft.com/office/word/2006/wordml" xmlns:wps="http://schemas.microsoft.com/office/word/2010/wordprocessingShape" mc:Ignorable="w14 w15 w16se w16cid w16 w16cex w16sdtdh w16sdtfl w16du wp14">
   <w:body>
     <w:p>
-      <w:r>
-        <w:t xml:space="preserve">  1. Planejamento e Serviços Preliminares: 3% a 5% </w:t>
-      </w:r>
-    </w:p>
-    <w:p>
-      <w:r>
-        <w:t xml:space="preserve">  2. Infraestrutura (Fundação): 10% a 15% </w:t>
-      </w:r>
-    </w:p>
-    <w:p>
-      <w:r>
-        <w:t xml:space="preserve">  3. Supraestrutura (Estrutura): 15% a 20% </w:t>
-      </w:r>
-    </w:p>
-    <w:p>
-      <w:r>
-        <w:t xml:space="preserve">  4. Alvenaria e Vedação: 10% a 15% </w:t>
-      </w:r>
-    </w:p>
-    <w:p>
-      <w:r>
-        <w:t xml:space="preserve">  5. Cobertura (Telhado): 5% a 8% </w:t>
-      </w:r>
-    </w:p>
-    <w:p>
-      <w:r>
-        <w:t xml:space="preserve">  6. Instalações Técnicas (Hidráulica/Elétrica): 10% a 12% </w:t>
-      </w:r>
-    </w:p>
-    <w:p>
-      <w:r>
-        <w:t xml:space="preserve">  7. Revestimentos e Acabamentos Internos: 20% a 30% </w:t>
-      </w:r>
-    </w:p>
-    <w:p>
-      <w:r>
-        <w:t xml:space="preserve">  8. Área Externa e Finalização: 5% a 10% </w:t>
+      <w:proofErr w:type="gramStart"/>
+      <w:r>
+        <w:t>  1</w:t>
+      </w:r>
+      <w:proofErr w:type="gramEnd"/>
+      <w:r>
+        <w:t xml:space="preserve">. Planejamento e Serviços Preliminares: 3% a 5% </w:t>
+      </w:r>
+    </w:p>
+    <w:p>
+      <w:proofErr w:type="gramStart"/>
+      <w:r>
+        <w:t>  2</w:t>
+      </w:r>
+      <w:proofErr w:type="gramEnd"/>
+      <w:r>
+        <w:t xml:space="preserve">. Infraestrutura (Fundação): 10% a 15% </w:t>
+      </w:r>
+    </w:p>
+    <w:p>
+      <w:proofErr w:type="gramStart"/>
+      <w:r>
+        <w:t>  3</w:t>
+      </w:r>
+      <w:proofErr w:type="gramEnd"/>
+      <w:r>
+        <w:t xml:space="preserve">. </w:t>
+      </w:r>
+      <w:proofErr w:type="spellStart"/>
+      <w:r>
+        <w:t>Supraestrutura</w:t>
+      </w:r>
+      <w:proofErr w:type="spellEnd"/>
+      <w:r>
+        <w:t xml:space="preserve"> (Estrutura): 15% a 20% </w:t>
+      </w:r>
+    </w:p>
+    <w:p>
+      <w:proofErr w:type="gramStart"/>
+      <w:r>
+        <w:t>  4</w:t>
+      </w:r>
+      <w:proofErr w:type="gramEnd"/>
+      <w:r>
+        <w:t xml:space="preserve">. Alvenaria e Vedação: 10% a 15% </w:t>
+      </w:r>
+    </w:p>
+    <w:p>
+      <w:proofErr w:type="gramStart"/>
+      <w:r>
+        <w:t>  5</w:t>
+      </w:r>
+      <w:proofErr w:type="gramEnd"/>
+      <w:r>
+        <w:t xml:space="preserve">. Cobertura (Telhado): 5% a 8% </w:t>
+      </w:r>
+    </w:p>
+    <w:p>
+      <w:proofErr w:type="gramStart"/>
+      <w:r>
+        <w:t>  6</w:t>
+      </w:r>
+      <w:proofErr w:type="gramEnd"/>
+      <w:r>
+        <w:t xml:space="preserve">. Instalações Técnicas (Hidráulica/Elétrica): 10% a 12% </w:t>
+      </w:r>
+    </w:p>
+    <w:p>
+      <w:proofErr w:type="gramStart"/>
+      <w:r>
+        <w:t>  7</w:t>
+      </w:r>
+      <w:proofErr w:type="gramEnd"/>
+      <w:r>
+        <w:t xml:space="preserve">. Revestimentos e Acabamentos Internos: 20% a 30% </w:t>
+      </w:r>
+    </w:p>
+    <w:p>
+      <w:proofErr w:type="gramStart"/>
+      <w:r>
+        <w:t>  8</w:t>
+      </w:r>
+      <w:proofErr w:type="gramEnd"/>
+      <w:r>
+        <w:t xml:space="preserve">. Área Externa e Finalização: 5% a 10% </w:t>
       </w:r>
     </w:p>
     <w:p/>
@@ -263,7 +311,23 @@
           <w:b/>
           <w:bCs/>
         </w:rPr>
-        <w:t>3. Supraestrutura (Estrutura)</w:t>
+        <w:t xml:space="preserve">3. </w:t>
+      </w:r>
+      <w:proofErr w:type="spellStart"/>
+      <w:r>
+        <w:rPr>
+          <w:b/>
+          <w:bCs/>
+        </w:rPr>
+        <w:t>Supraestrutura</w:t>
+      </w:r>
+      <w:proofErr w:type="spellEnd"/>
+      <w:r>
+        <w:rPr>
+          <w:b/>
+          <w:bCs/>
+        </w:rPr>
+        <w:t xml:space="preserve"> (Estrutura)</w:t>
       </w:r>
     </w:p>
     <w:p>
@@ -384,7 +448,23 @@
           <w:b/>
           <w:bCs/>
         </w:rPr>
-        <w:t>Vergas e Contravergas:</w:t>
+        <w:t xml:space="preserve">Vergas e </w:t>
+      </w:r>
+      <w:proofErr w:type="spellStart"/>
+      <w:r>
+        <w:rPr>
+          <w:b/>
+          <w:bCs/>
+        </w:rPr>
+        <w:t>Contravergas</w:t>
+      </w:r>
+      <w:proofErr w:type="spellEnd"/>
+      <w:r>
+        <w:rPr>
+          <w:b/>
+          <w:bCs/>
+        </w:rPr>
+        <w:t>:</w:t>
       </w:r>
       <w:r>
         <w:t xml:space="preserve"> Reforços sobre e sob vãos de janelas e portas.</w:t>
@@ -457,12 +537,21 @@
           <w:numId w:val="5"/>
         </w:numPr>
       </w:pPr>
-      <w:r>
-        <w:rPr>
-          <w:b/>
-          <w:bCs/>
-        </w:rPr>
-        <w:t>Telhamento:</w:t>
+      <w:proofErr w:type="spellStart"/>
+      <w:r>
+        <w:rPr>
+          <w:b/>
+          <w:bCs/>
+        </w:rPr>
+        <w:t>Telhamento</w:t>
+      </w:r>
+      <w:proofErr w:type="spellEnd"/>
+      <w:r>
+        <w:rPr>
+          <w:b/>
+          <w:bCs/>
+        </w:rPr>
+        <w:t>:</w:t>
       </w:r>
       <w:r>
         <w:t xml:space="preserve"> Colocação de telhas e vedação técnica.</w:t>
@@ -657,7 +746,15 @@
         <w:t>Forros:</w:t>
       </w:r>
       <w:r>
-        <w:t xml:space="preserve"> Gesso liso ou gesso acartonado (drywall).</w:t>
+        <w:t xml:space="preserve"> Gesso liso ou gesso acartonado (</w:t>
+      </w:r>
+      <w:proofErr w:type="spellStart"/>
+      <w:r>
+        <w:t>drywall</w:t>
+      </w:r>
+      <w:proofErr w:type="spellEnd"/>
+      <w:r>
+        <w:t>).</w:t>
       </w:r>
     </w:p>
     <w:p>
@@ -786,9 +883,36 @@
     </w:p>
     <w:p>
       <w:r>
-        <w:t>- envie o git</w:t>
-      </w:r>
-    </w:p>
+        <w:t xml:space="preserve">- </w:t>
+      </w:r>
+      <w:proofErr w:type="gramStart"/>
+      <w:r>
+        <w:t>envie</w:t>
+      </w:r>
+      <w:proofErr w:type="gramEnd"/>
+      <w:r>
+        <w:t xml:space="preserve"> o </w:t>
+      </w:r>
+      <w:proofErr w:type="spellStart"/>
+      <w:r>
+        <w:t>git</w:t>
+      </w:r>
+      <w:proofErr w:type="spellEnd"/>
+    </w:p>
+    <w:p>
+      <w:r>
+        <w:t xml:space="preserve">- </w:t>
+      </w:r>
+      <w:proofErr w:type="gramStart"/>
+      <w:r>
+        <w:t>envie</w:t>
+      </w:r>
+      <w:proofErr w:type="gramEnd"/>
+      <w:r>
+        <w:t xml:space="preserve"> o trecho completo</w:t>
+      </w:r>
+    </w:p>
+    <w:p/>
     <w:sectPr>
       <w:pgSz w:w="11906" w:h="16838"/>
       <w:pgMar w:top="1417" w:right="1701" w:bottom="1417" w:left="1701" w:header="708" w:footer="708" w:gutter="0"/>

</xml_diff>